<commit_message>
refactor(analysis): harmonize APA palettes, integrate human validation, and add reproducibility test suite)
</commit_message>
<xml_diff>
--- a/results/Anexo_TRIPOD_LLM_Checklist.docx
+++ b/results/Anexo_TRIPOD_LLM_Checklist.docx
@@ -706,7 +706,7 @@
                 <w:szCs w:val="18"/>
                 <w:color w:val="000000"/>
               </w:rPr>
-              <w:t xml:space="preserve"/>
+              <w:t xml:space="preserve">1, 5</w:t>
             </w:r>
           </w:p>
         </w:tc>
@@ -1041,7 +1041,7 @@
                 <w:szCs w:val="18"/>
                 <w:color w:val="000000"/>
               </w:rPr>
-              <w:t xml:space="preserve"/>
+              <w:t xml:space="preserve">5</w:t>
             </w:r>
           </w:p>
         </w:tc>
@@ -1376,7 +1376,7 @@
                 <w:szCs w:val="18"/>
                 <w:color w:val="000000"/>
               </w:rPr>
-              <w:t xml:space="preserve"/>
+              <w:t xml:space="preserve">5</w:t>
             </w:r>
           </w:p>
         </w:tc>
@@ -1712,7 +1712,7 @@
                 <w:szCs w:val="18"/>
                 <w:color w:val="000000"/>
               </w:rPr>
-              <w:t xml:space="preserve"/>
+              <w:t xml:space="preserve">5</w:t>
             </w:r>
           </w:p>
         </w:tc>
@@ -2035,7 +2035,7 @@
                 <w:szCs w:val="18"/>
                 <w:color w:val="000000"/>
               </w:rPr>
-              <w:t xml:space="preserve"/>
+              <w:t xml:space="preserve">5</w:t>
             </w:r>
           </w:p>
         </w:tc>
@@ -2358,7 +2358,7 @@
                 <w:szCs w:val="18"/>
                 <w:color w:val="000000"/>
               </w:rPr>
-              <w:t xml:space="preserve"/>
+              <w:t xml:space="preserve">5</w:t>
             </w:r>
           </w:p>
         </w:tc>
@@ -2681,7 +2681,7 @@
                 <w:szCs w:val="18"/>
                 <w:color w:val="000000"/>
               </w:rPr>
-              <w:t xml:space="preserve"/>
+              <w:t xml:space="preserve">5</w:t>
             </w:r>
           </w:p>
         </w:tc>
@@ -3004,7 +3004,7 @@
                 <w:szCs w:val="18"/>
                 <w:color w:val="000000"/>
               </w:rPr>
-              <w:t xml:space="preserve"/>
+              <w:t xml:space="preserve">5</w:t>
             </w:r>
           </w:p>
         </w:tc>
@@ -3327,7 +3327,7 @@
                 <w:szCs w:val="18"/>
                 <w:color w:val="000000"/>
               </w:rPr>
-              <w:t xml:space="preserve"/>
+              <w:t xml:space="preserve">5</w:t>
             </w:r>
           </w:p>
         </w:tc>
@@ -3662,7 +3662,7 @@
                 <w:szCs w:val="18"/>
                 <w:color w:val="000000"/>
               </w:rPr>
-              <w:t xml:space="preserve"/>
+              <w:t xml:space="preserve">5</w:t>
             </w:r>
           </w:p>
         </w:tc>
@@ -3997,7 +3997,7 @@
                 <w:szCs w:val="18"/>
                 <w:color w:val="000000"/>
               </w:rPr>
-              <w:t xml:space="preserve"/>
+              <w:t xml:space="preserve">5</w:t>
             </w:r>
           </w:p>
         </w:tc>
@@ -4332,7 +4332,7 @@
                 <w:szCs w:val="18"/>
                 <w:color w:val="000000"/>
               </w:rPr>
-              <w:t xml:space="preserve"/>
+              <w:t xml:space="preserve">5, 46</w:t>
             </w:r>
           </w:p>
         </w:tc>
@@ -4668,7 +4668,7 @@
                 <w:szCs w:val="18"/>
                 <w:color w:val="000000"/>
               </w:rPr>
-              <w:t xml:space="preserve"/>
+              <w:t xml:space="preserve">6-7</w:t>
             </w:r>
           </w:p>
         </w:tc>
@@ -4991,7 +4991,7 @@
                 <w:szCs w:val="18"/>
                 <w:color w:val="000000"/>
               </w:rPr>
-              <w:t xml:space="preserve"/>
+              <w:t xml:space="preserve">7</w:t>
             </w:r>
           </w:p>
         </w:tc>
@@ -5326,7 +5326,7 @@
                 <w:szCs w:val="18"/>
                 <w:color w:val="000000"/>
               </w:rPr>
-              <w:t xml:space="preserve"/>
+              <w:t xml:space="preserve">8-9</w:t>
             </w:r>
           </w:p>
         </w:tc>
@@ -5662,7 +5662,7 @@
                 <w:szCs w:val="18"/>
                 <w:color w:val="000000"/>
               </w:rPr>
-              <w:t xml:space="preserve"/>
+              <w:t xml:space="preserve">10, 23</w:t>
             </w:r>
           </w:p>
         </w:tc>
@@ -5985,7 +5985,7 @@
                 <w:szCs w:val="18"/>
                 <w:color w:val="000000"/>
               </w:rPr>
-              <w:t xml:space="preserve"/>
+              <w:t xml:space="preserve">13-15</w:t>
             </w:r>
           </w:p>
         </w:tc>
@@ -6308,7 +6308,7 @@
                 <w:szCs w:val="18"/>
                 <w:color w:val="000000"/>
               </w:rPr>
-              <w:t xml:space="preserve"/>
+              <w:t xml:space="preserve">13, 20</w:t>
             </w:r>
           </w:p>
         </w:tc>
@@ -6631,7 +6631,7 @@
                 <w:szCs w:val="18"/>
                 <w:color w:val="000000"/>
               </w:rPr>
-              <w:t xml:space="preserve"/>
+              <w:t xml:space="preserve">11, 16-17</w:t>
             </w:r>
           </w:p>
         </w:tc>
@@ -6954,7 +6954,7 @@
                 <w:szCs w:val="18"/>
                 <w:color w:val="000000"/>
               </w:rPr>
-              <w:t xml:space="preserve"/>
+              <w:t xml:space="preserve">13, 17, 23</w:t>
             </w:r>
           </w:p>
         </w:tc>
@@ -7290,7 +7290,7 @@
                 <w:szCs w:val="18"/>
                 <w:color w:val="000000"/>
               </w:rPr>
-              <w:t xml:space="preserve"/>
+              <w:t xml:space="preserve">15, 18</w:t>
             </w:r>
           </w:p>
         </w:tc>
@@ -7613,7 +7613,7 @@
                 <w:szCs w:val="18"/>
                 <w:color w:val="000000"/>
               </w:rPr>
-              <w:t xml:space="preserve"/>
+              <w:t xml:space="preserve">16, 20</w:t>
             </w:r>
           </w:p>
         </w:tc>
@@ -7936,7 +7936,7 @@
                 <w:szCs w:val="18"/>
                 <w:color w:val="000000"/>
               </w:rPr>
-              <w:t xml:space="preserve"/>
+              <w:t xml:space="preserve">12, 20-21</w:t>
             </w:r>
           </w:p>
         </w:tc>
@@ -8259,7 +8259,7 @@
                 <w:szCs w:val="18"/>
                 <w:color w:val="000000"/>
               </w:rPr>
-              <w:t xml:space="preserve"/>
+              <w:t xml:space="preserve">16, 18-19</w:t>
             </w:r>
           </w:p>
         </w:tc>
@@ -8582,7 +8582,7 @@
                 <w:szCs w:val="18"/>
                 <w:color w:val="000000"/>
               </w:rPr>
-              <w:t xml:space="preserve"/>
+              <w:t xml:space="preserve">17, 22-23</w:t>
             </w:r>
           </w:p>
         </w:tc>
@@ -8905,7 +8905,7 @@
                 <w:szCs w:val="18"/>
                 <w:color w:val="000000"/>
               </w:rPr>
-              <w:t xml:space="preserve">Not Required</w:t>
+              <w:t xml:space="preserve">20</w:t>
             </w:r>
           </w:p>
         </w:tc>
@@ -9228,7 +9228,7 @@
                 <w:szCs w:val="18"/>
                 <w:color w:val="000000"/>
               </w:rPr>
-              <w:t xml:space="preserve"/>
+              <w:t xml:space="preserve">22, 36-37</w:t>
             </w:r>
           </w:p>
         </w:tc>
@@ -9564,7 +9564,7 @@
                 <w:szCs w:val="18"/>
                 <w:color w:val="000000"/>
               </w:rPr>
-              <w:t xml:space="preserve"/>
+              <w:t xml:space="preserve">21-23</w:t>
             </w:r>
           </w:p>
         </w:tc>
@@ -9887,7 +9887,7 @@
                 <w:szCs w:val="18"/>
                 <w:color w:val="000000"/>
               </w:rPr>
-              <w:t xml:space="preserve"/>
+              <w:t xml:space="preserve">23</w:t>
             </w:r>
           </w:p>
         </w:tc>
@@ -10210,7 +10210,7 @@
                 <w:szCs w:val="18"/>
                 <w:color w:val="000000"/>
               </w:rPr>
-              <w:t xml:space="preserve"/>
+              <w:t xml:space="preserve">15, 22</w:t>
             </w:r>
           </w:p>
         </w:tc>
@@ -10546,7 +10546,7 @@
                 <w:szCs w:val="18"/>
                 <w:color w:val="000000"/>
               </w:rPr>
-              <w:t xml:space="preserve"/>
+              <w:t xml:space="preserve">13, 23</w:t>
             </w:r>
           </w:p>
         </w:tc>
@@ -10869,7 +10869,7 @@
                 <w:szCs w:val="18"/>
                 <w:color w:val="000000"/>
               </w:rPr>
-              <w:t xml:space="preserve"/>
+              <w:t xml:space="preserve">23</w:t>
             </w:r>
           </w:p>
         </w:tc>
@@ -11192,7 +11192,7 @@
                 <w:szCs w:val="18"/>
                 <w:color w:val="000000"/>
               </w:rPr>
-              <w:t xml:space="preserve"/>
+              <w:t xml:space="preserve">23</w:t>
             </w:r>
           </w:p>
         </w:tc>
@@ -11528,7 +11528,7 @@
                 <w:szCs w:val="18"/>
                 <w:color w:val="000000"/>
               </w:rPr>
-              <w:t xml:space="preserve"/>
+              <w:t xml:space="preserve">12, 20-21</w:t>
             </w:r>
           </w:p>
         </w:tc>
@@ -11851,7 +11851,7 @@
                 <w:szCs w:val="18"/>
                 <w:color w:val="000000"/>
               </w:rPr>
-              <w:t xml:space="preserve"/>
+              <w:t xml:space="preserve">21</w:t>
             </w:r>
           </w:p>
         </w:tc>
@@ -12186,7 +12186,7 @@
                 <w:szCs w:val="18"/>
                 <w:color w:val="000000"/>
               </w:rPr>
-              <w:t xml:space="preserve">Not Required</w:t>
+              <w:t xml:space="preserve">Not Req.</w:t>
             </w:r>
           </w:p>
         </w:tc>
@@ -12521,7 +12521,7 @@
                 <w:szCs w:val="18"/>
                 <w:color w:val="000000"/>
               </w:rPr>
-              <w:t xml:space="preserve"/>
+              <w:t xml:space="preserve">20-21</w:t>
             </w:r>
           </w:p>
         </w:tc>
@@ -12856,7 +12856,7 @@
                 <w:szCs w:val="18"/>
                 <w:color w:val="000000"/>
               </w:rPr>
-              <w:t xml:space="preserve"/>
+              <w:t xml:space="preserve">22, 27-28, 35</w:t>
             </w:r>
           </w:p>
         </w:tc>
@@ -13191,7 +13191,7 @@
                 <w:szCs w:val="18"/>
                 <w:color w:val="000000"/>
               </w:rPr>
-              <w:t xml:space="preserve"/>
+              <w:t xml:space="preserve">23</w:t>
             </w:r>
           </w:p>
         </w:tc>
@@ -13527,7 +13527,7 @@
                 <w:szCs w:val="18"/>
                 <w:color w:val="000000"/>
               </w:rPr>
-              <w:t xml:space="preserve"/>
+              <w:t xml:space="preserve">46</w:t>
             </w:r>
           </w:p>
         </w:tc>
@@ -13850,7 +13850,7 @@
                 <w:szCs w:val="18"/>
                 <w:color w:val="000000"/>
               </w:rPr>
-              <w:t xml:space="preserve"/>
+              <w:t xml:space="preserve">46</w:t>
             </w:r>
           </w:p>
         </w:tc>
@@ -14173,7 +14173,7 @@
                 <w:szCs w:val="18"/>
                 <w:color w:val="000000"/>
               </w:rPr>
-              <w:t xml:space="preserve"/>
+              <w:t xml:space="preserve">10, 46</w:t>
             </w:r>
           </w:p>
         </w:tc>
@@ -14496,7 +14496,7 @@
                 <w:szCs w:val="18"/>
                 <w:color w:val="000000"/>
               </w:rPr>
-              <w:t xml:space="preserve"/>
+              <w:t xml:space="preserve">46</w:t>
             </w:r>
           </w:p>
         </w:tc>
@@ -14819,7 +14819,7 @@
                 <w:szCs w:val="18"/>
                 <w:color w:val="000000"/>
               </w:rPr>
-              <w:t xml:space="preserve"/>
+              <w:t xml:space="preserve">46</w:t>
             </w:r>
           </w:p>
         </w:tc>
@@ -15142,7 +15142,7 @@
                 <w:szCs w:val="18"/>
                 <w:color w:val="000000"/>
               </w:rPr>
-              <w:t xml:space="preserve"/>
+              <w:t xml:space="preserve">10, 46</w:t>
             </w:r>
           </w:p>
         </w:tc>
@@ -15477,7 +15477,7 @@
                 <w:szCs w:val="18"/>
                 <w:color w:val="000000"/>
               </w:rPr>
-              <w:t xml:space="preserve"/>
+              <w:t xml:space="preserve">23</w:t>
             </w:r>
           </w:p>
         </w:tc>
@@ -15813,7 +15813,7 @@
                 <w:szCs w:val="18"/>
                 <w:color w:val="000000"/>
               </w:rPr>
-              <w:t xml:space="preserve"/>
+              <w:t xml:space="preserve">10, 17, 24, 30</w:t>
             </w:r>
           </w:p>
         </w:tc>
@@ -16136,7 +16136,7 @@
                 <w:szCs w:val="18"/>
                 <w:color w:val="000000"/>
               </w:rPr>
-              <w:t xml:space="preserve"/>
+              <w:t xml:space="preserve">13, 30</w:t>
             </w:r>
           </w:p>
         </w:tc>
@@ -16459,7 +16459,7 @@
                 <w:szCs w:val="18"/>
                 <w:color w:val="000000"/>
               </w:rPr>
-              <w:t xml:space="preserve"/>
+              <w:t xml:space="preserve">14-15, 32, 34</w:t>
             </w:r>
           </w:p>
         </w:tc>
@@ -16782,7 +16782,7 @@
                 <w:szCs w:val="18"/>
                 <w:color w:val="000000"/>
               </w:rPr>
-              <w:t xml:space="preserve"/>
+              <w:t xml:space="preserve">25, 30</w:t>
             </w:r>
           </w:p>
         </w:tc>
@@ -17117,7 +17117,7 @@
                 <w:szCs w:val="18"/>
                 <w:color w:val="000000"/>
               </w:rPr>
-              <w:t xml:space="preserve"/>
+              <w:t xml:space="preserve">24-36</w:t>
             </w:r>
           </w:p>
         </w:tc>
@@ -17452,7 +17452,7 @@
                 <w:szCs w:val="18"/>
                 <w:color w:val="000000"/>
               </w:rPr>
-              <w:t xml:space="preserve"/>
+              <w:t xml:space="preserve">Not Req.</w:t>
             </w:r>
           </w:p>
         </w:tc>
@@ -17787,7 +17787,7 @@
                 <w:szCs w:val="18"/>
                 <w:color w:val="000000"/>
               </w:rPr>
-              <w:t xml:space="preserve"/>
+              <w:t xml:space="preserve">36-37</w:t>
             </w:r>
           </w:p>
         </w:tc>
@@ -18122,7 +18122,7 @@
                 <w:szCs w:val="18"/>
                 <w:color w:val="000000"/>
               </w:rPr>
-              <w:t xml:space="preserve"/>
+              <w:t xml:space="preserve">38-39</w:t>
             </w:r>
           </w:p>
         </w:tc>
@@ -18458,7 +18458,7 @@
                 <w:szCs w:val="18"/>
                 <w:color w:val="000000"/>
               </w:rPr>
-              <w:t xml:space="preserve"/>
+              <w:t xml:space="preserve">37-38</w:t>
             </w:r>
           </w:p>
         </w:tc>
@@ -18781,7 +18781,7 @@
                 <w:szCs w:val="18"/>
                 <w:color w:val="000000"/>
               </w:rPr>
-              <w:t xml:space="preserve"/>
+              <w:t xml:space="preserve">38-39, 41</w:t>
             </w:r>
           </w:p>
         </w:tc>
@@ -19104,7 +19104,7 @@
                 <w:szCs w:val="18"/>
                 <w:color w:val="000000"/>
               </w:rPr>
-              <w:t xml:space="preserve"/>
+              <w:t xml:space="preserve">37-38</w:t>
             </w:r>
           </w:p>
         </w:tc>
@@ -19427,7 +19427,7 @@
                 <w:szCs w:val="18"/>
                 <w:color w:val="000000"/>
               </w:rPr>
-              <w:t xml:space="preserve"/>
+              <w:t xml:space="preserve">39</w:t>
             </w:r>
           </w:p>
         </w:tc>
@@ -19750,7 +19750,7 @@
                 <w:szCs w:val="18"/>
                 <w:color w:val="000000"/>
               </w:rPr>
-              <w:t xml:space="preserve"/>
+              <w:t xml:space="preserve">39, 41</w:t>
             </w:r>
           </w:p>
         </w:tc>

</xml_diff>